<commit_message>
Add author name to the discovery reports
</commit_message>
<xml_diff>
--- a/week-2-secure-network/docs/Discovery Report.docx
+++ b/week-2-secure-network/docs/Discovery Report.docx
@@ -122,7 +122,7 @@
           </w:tcPr>
           <w:p>
             <w:r>
-              <w:t>[Your full name] </w:t>
+              <w:t>Jado Fils SEZIKEYE </w:t>
             </w:r>
           </w:p>
         </w:tc>
@@ -792,7 +792,7 @@
         <w:t xml:space="preserve">Naming and tags:</w:t>
       </w:r>
       <w:r>
-        <w:t xml:space="preserve"> resources follow onward-dev-&lt;purpose&gt; (for example onward-dev-orders-vpc) and carry Project=onward, Owner=[Your full name] and Environment=dev.</w:t>
+        <w:t xml:space="preserve"> resources follow onward-dev-&lt;purpose&gt; (for example onward-dev-orders-vpc) and carry Project=onward, Owner=Jado Fils SEZIKEYE and Environment=dev.</w:t>
       </w:r>
     </w:p>
     <w:p>

</xml_diff>